<commit_message>
Align the CIIS talking points with the final research briefing
Add two sentences to the speech that pair model-side AI safety with
the capacity of the people who use AI, the argument the briefing
treats as strongest at a governance roundtable. Add a prepared answer
on the AI ethics and safety initiative announced in Nanning in
September, and route follow-up cooperation in answer 9 through the
relevant ASEAN bodies. Update the timings and word count, keep the
last lines of a paragraph together across pages, and fix the order
of two style properties in the Korean file.

Co-Authored-By: Claude Opus 5.5 <noreply@anthropic.com>
Claude-Session: https://claude.ai/code/session_01DwyReAbHuerDM9qQp6F7Yx
</commit_message>
<xml_diff>
--- a/talking-points-ciis-en.docx
+++ b/talking-points-ciis-en.docx
@@ -378,7 +378,7 @@
               <w:rPr>
                 <w:rFonts w:eastAsia="Calibri"/>
               </w:rPr>
-              <w:t>6–7 minutes. Core script about 810 words (about 6½ minutes); optional lines add about 110 words</w:t>
+              <w:t>6–7 minutes. Core script about 840 words (about 6 minutes 40 seconds); optional lines add about 110 words</w:t>
             </w:r>
           </w:p>
         </w:tc>
@@ -443,6 +443,7 @@
     </w:p>
     <w:p>
       <w:pPr>
+        <w:widowControl/>
         <w:spacing w:after="120" w:line="336" w:lineRule="auto"/>
         <w:jc w:val="both"/>
       </w:pPr>
@@ -458,6 +459,7 @@
     <w:p>
       <w:pPr>
         <w:pStyle w:val="a4"/>
+        <w:widowControl/>
         <w:numPr>
           <w:ilvl w:val="0"/>
           <w:numId w:val="3"/>
@@ -483,6 +485,7 @@
     <w:p>
       <w:pPr>
         <w:pStyle w:val="a4"/>
+        <w:widowControl/>
         <w:numPr>
           <w:ilvl w:val="0"/>
           <w:numId w:val="3"/>
@@ -508,6 +511,7 @@
     <w:p>
       <w:pPr>
         <w:pStyle w:val="a4"/>
+        <w:widowControl/>
         <w:numPr>
           <w:ilvl w:val="0"/>
           <w:numId w:val="3"/>
@@ -549,6 +553,7 @@
     </w:p>
     <w:p>
       <w:pPr>
+        <w:widowControl/>
         <w:spacing w:after="120" w:line="336" w:lineRule="auto"/>
         <w:jc w:val="both"/>
       </w:pPr>
@@ -562,6 +567,7 @@
     <w:p>
       <w:pPr>
         <w:pStyle w:val="a4"/>
+        <w:widowControl/>
         <w:numPr>
           <w:ilvl w:val="0"/>
           <w:numId w:val="2"/>
@@ -587,6 +593,7 @@
     <w:p>
       <w:pPr>
         <w:pStyle w:val="a4"/>
+        <w:widowControl/>
         <w:numPr>
           <w:ilvl w:val="0"/>
           <w:numId w:val="2"/>
@@ -612,6 +619,7 @@
     <w:p>
       <w:pPr>
         <w:pStyle w:val="a4"/>
+        <w:widowControl/>
         <w:numPr>
           <w:ilvl w:val="0"/>
           <w:numId w:val="2"/>
@@ -637,6 +645,7 @@
     <w:p>
       <w:pPr>
         <w:pStyle w:val="a4"/>
+        <w:widowControl/>
         <w:numPr>
           <w:ilvl w:val="0"/>
           <w:numId w:val="4"/>
@@ -662,6 +671,7 @@
     <w:p>
       <w:pPr>
         <w:pStyle w:val="a4"/>
+        <w:widowControl/>
         <w:numPr>
           <w:ilvl w:val="0"/>
           <w:numId w:val="4"/>
@@ -687,6 +697,7 @@
     <w:p>
       <w:pPr>
         <w:pStyle w:val="a4"/>
+        <w:widowControl/>
         <w:numPr>
           <w:ilvl w:val="0"/>
           <w:numId w:val="4"/>
@@ -712,6 +723,7 @@
     <w:p>
       <w:pPr>
         <w:pStyle w:val="a4"/>
+        <w:widowControl/>
         <w:numPr>
           <w:ilvl w:val="0"/>
           <w:numId w:val="4"/>
@@ -754,6 +766,7 @@
     </w:p>
     <w:p>
       <w:pPr>
+        <w:widowControl/>
         <w:spacing w:after="120" w:line="336" w:lineRule="auto"/>
         <w:jc w:val="both"/>
       </w:pPr>
@@ -761,7 +774,7 @@
         <w:rPr>
           <w:rFonts w:eastAsia="Calibri"/>
         </w:rPr>
-        <w:t xml:space="preserve">About 6½ minutes for the core script (about 810 words). Lines marked </w:t>
+        <w:t xml:space="preserve">About 6 minutes 40 seconds for the core script (about 840 words). Lines marked </w:t>
       </w:r>
       <w:r>
         <w:rPr>
@@ -798,6 +811,7 @@
     </w:p>
     <w:p>
       <w:pPr>
+        <w:widowControl/>
         <w:spacing w:after="120" w:line="336" w:lineRule="auto"/>
         <w:jc w:val="both"/>
       </w:pPr>
@@ -825,6 +839,7 @@
     </w:p>
     <w:p>
       <w:pPr>
+        <w:widowControl/>
         <w:spacing w:after="120" w:line="336" w:lineRule="auto"/>
         <w:jc w:val="both"/>
       </w:pPr>
@@ -863,6 +878,7 @@
     </w:p>
     <w:p>
       <w:pPr>
+        <w:widowControl/>
         <w:spacing w:after="120" w:line="336" w:lineRule="auto"/>
         <w:jc w:val="both"/>
       </w:pPr>
@@ -875,6 +891,7 @@
     </w:p>
     <w:p>
       <w:pPr>
+        <w:widowControl/>
         <w:spacing w:after="120" w:line="336" w:lineRule="auto"/>
         <w:jc w:val="both"/>
       </w:pPr>
@@ -899,11 +916,12 @@
           <w:sz w:val="22"/>
           <w:szCs w:val="22"/>
         </w:rPr>
-        <w:t>3.3 What We Learned in Singapore (1:20–3:40)</w:t>
-      </w:r>
-    </w:p>
-    <w:p>
-      <w:pPr>
+        <w:t>3.3 What We Learned in Singapore (1:20–3:50)</w:t>
+      </w:r>
+    </w:p>
+    <w:p>
+      <w:pPr>
+        <w:widowControl/>
         <w:spacing w:after="120" w:line="336" w:lineRule="auto"/>
         <w:jc w:val="both"/>
       </w:pPr>
@@ -916,6 +934,7 @@
     </w:p>
     <w:p>
       <w:pPr>
+        <w:widowControl/>
         <w:spacing w:after="120" w:line="336" w:lineRule="auto"/>
         <w:jc w:val="both"/>
       </w:pPr>
@@ -951,6 +970,7 @@
     </w:p>
     <w:p>
       <w:pPr>
+        <w:widowControl/>
         <w:spacing w:after="120" w:line="336" w:lineRule="auto"/>
         <w:jc w:val="both"/>
       </w:pPr>
@@ -971,6 +991,7 @@
     </w:p>
     <w:p>
       <w:pPr>
+        <w:widowControl/>
         <w:spacing w:after="120" w:line="336" w:lineRule="auto"/>
         <w:jc w:val="both"/>
       </w:pPr>
@@ -1006,6 +1027,7 @@
     </w:p>
     <w:p>
       <w:pPr>
+        <w:widowControl/>
         <w:spacing w:after="120" w:line="336" w:lineRule="auto"/>
         <w:jc w:val="both"/>
       </w:pPr>
@@ -1013,7 +1035,7 @@
         <w:rPr>
           <w:rFonts w:eastAsia="Calibri"/>
         </w:rPr>
-        <w:t>This is where governance meets the shop floor. For a small business, governance is a daily decision: what data to put in, who checks the output, who is accountable. Capacity building turns principles into decisions people can make.</w:t>
+        <w:t>This is where governance meets the shop floor. Much of the work on AI safety rightly focuses on the models themselves: testing, standards and evaluation. But safety also depends on the people who use AI. For a small business, governance is a daily decision: what data to put in, who checks the output, who is accountable. Capacity building turns principles into decisions people can make.</w:t>
       </w:r>
     </w:p>
     <w:p>
@@ -1030,11 +1052,12 @@
           <w:sz w:val="22"/>
           <w:szCs w:val="22"/>
         </w:rPr>
-        <w:t>3.4 Three Suggestions (3:40–5:50)</w:t>
-      </w:r>
-    </w:p>
-    <w:p>
-      <w:pPr>
+        <w:t>3.4 Three Suggestions (3:50–6:00)</w:t>
+      </w:r>
+    </w:p>
+    <w:p>
+      <w:pPr>
+        <w:widowControl/>
         <w:spacing w:after="120" w:line="336" w:lineRule="auto"/>
         <w:jc w:val="both"/>
       </w:pPr>
@@ -1062,6 +1085,7 @@
     </w:p>
     <w:p>
       <w:pPr>
+        <w:widowControl/>
         <w:spacing w:after="120" w:line="336" w:lineRule="auto"/>
         <w:jc w:val="both"/>
       </w:pPr>
@@ -1082,6 +1106,7 @@
     </w:p>
     <w:p>
       <w:pPr>
+        <w:widowControl/>
         <w:spacing w:after="120" w:line="336" w:lineRule="auto"/>
         <w:jc w:val="both"/>
       </w:pPr>
@@ -1102,6 +1127,7 @@
     </w:p>
     <w:p>
       <w:pPr>
+        <w:widowControl/>
         <w:spacing w:after="120" w:line="336" w:lineRule="auto"/>
         <w:jc w:val="both"/>
       </w:pPr>
@@ -1122,6 +1148,7 @@
     </w:p>
     <w:p>
       <w:pPr>
+        <w:widowControl/>
         <w:spacing w:after="120" w:line="336" w:lineRule="auto"/>
         <w:jc w:val="both"/>
       </w:pPr>
@@ -1161,11 +1188,12 @@
           <w:sz w:val="22"/>
           <w:szCs w:val="22"/>
         </w:rPr>
-        <w:t>3.5 Closing (5:50–6:30)</w:t>
-      </w:r>
-    </w:p>
-    <w:p>
-      <w:pPr>
+        <w:t>3.5 Closing (6:00–6:40)</w:t>
+      </w:r>
+    </w:p>
+    <w:p>
+      <w:pPr>
+        <w:widowControl/>
         <w:spacing w:after="120" w:line="336" w:lineRule="auto"/>
         <w:jc w:val="both"/>
       </w:pPr>
@@ -1196,6 +1224,7 @@
     </w:p>
     <w:p>
       <w:pPr>
+        <w:widowControl/>
         <w:spacing w:after="120" w:line="336" w:lineRule="auto"/>
         <w:jc w:val="both"/>
       </w:pPr>
@@ -1778,7 +1807,7 @@
               <w:rPr>
                 <w:rFonts w:eastAsia="Calibri"/>
               </w:rPr>
-              <w:t>We have run youth exchanges with China’s Mission to ASEAN, supported by the ASEAN–China Cooperation Fund, and worked with Huawei on ASEAN Seeds for the Future (MoU signed in 2021). Our test is whether cooperation helps MSMEs in practice. Specific cooperation is a matter for follow-up discussion.</w:t>
+              <w:t>We have run youth exchanges with China’s Mission to ASEAN, supported by the ASEAN–China Cooperation Fund, and worked with Huawei on ASEAN Seeds for the Future (MoU signed in 2021). Our test is whether cooperation helps MSMEs in practice. Specific cooperation is a matter for follow-up discussion, through the relevant ASEAN bodies.</w:t>
             </w:r>
           </w:p>
         </w:tc>
@@ -2032,7 +2061,7 @@
               <w:rPr>
                 <w:rFonts w:eastAsia="Calibri"/>
               </w:rPr>
-              <w:t>Will the ASEAN AI Safety Network cooperate with China?</w:t>
+              <w:t>What do you make of the AI ethics and safety initiative announced in Nanning in September?</w:t>
             </w:r>
           </w:p>
         </w:tc>
@@ -2048,7 +2077,7 @@
               <w:rPr>
                 <w:rFonts w:eastAsia="Calibri"/>
               </w:rPr>
-              <w:t>ASEAN AI Safe is an ASEAN mechanism, so that is for the ASEAN Secretariat and member states to answer.</w:t>
+              <w:t>We welcome the attention to ethics and safety in ASEAN–China cooperation. How it is taken forward is for ASEAN and China to decide, through ASEAN’s own processes. From our field work, one point to add: safety also depends on the people who use AI, and on whether a small business can judge what data to use, who checks the output and who is accountable. Do not comment on its content, which has not been made public.</w:t>
             </w:r>
           </w:p>
         </w:tc>
@@ -2086,7 +2115,7 @@
               <w:rPr>
                 <w:rFonts w:eastAsia="Calibri"/>
               </w:rPr>
-              <w:t>What does the MSME chapter of the ACFTA 3.0 upgrade mean on the ground?</w:t>
+              <w:t>Will the ASEAN AI Safety Network cooperate with China?</w:t>
             </w:r>
           </w:p>
         </w:tc>
@@ -2102,7 +2131,7 @@
               <w:rPr>
                 <w:rFonts w:eastAsia="Calibri"/>
               </w:rPr>
-              <w:t>Information sharing and digital transformation cooperation only become real benefits if MSMEs have the capacity to use them. Capacity building carries those benefits to the shop floor. Entry into force is for the parties to decide.</w:t>
+              <w:t>ASEAN AI Safe is an ASEAN mechanism, so that is for the ASEAN Secretariat and member states to answer.</w:t>
             </w:r>
           </w:p>
         </w:tc>
@@ -2125,6 +2154,60 @@
                 <w:rFonts w:eastAsia="Calibri"/>
               </w:rPr>
               <w:t>16</w:t>
+            </w:r>
+          </w:p>
+        </w:tc>
+        <w:tc>
+          <w:tcPr>
+            <w:tcW w:w="2700" w:type="dxa"/>
+          </w:tcPr>
+          <w:p>
+            <w:pPr>
+              <w:spacing w:line="276" w:lineRule="auto"/>
+            </w:pPr>
+            <w:r>
+              <w:rPr>
+                <w:rFonts w:eastAsia="Calibri"/>
+              </w:rPr>
+              <w:t>What does the MSME chapter of the ACFTA 3.0 upgrade mean on the ground?</w:t>
+            </w:r>
+          </w:p>
+        </w:tc>
+        <w:tc>
+          <w:tcPr>
+            <w:tcW w:w="6480" w:type="dxa"/>
+          </w:tcPr>
+          <w:p>
+            <w:pPr>
+              <w:spacing w:line="276" w:lineRule="auto"/>
+            </w:pPr>
+            <w:r>
+              <w:rPr>
+                <w:rFonts w:eastAsia="Calibri"/>
+              </w:rPr>
+              <w:t>Information sharing and digital transformation cooperation only become real benefits if MSMEs have the capacity to use them. Capacity building carries those benefits to the shop floor. Entry into force is for the parties to decide.</w:t>
+            </w:r>
+          </w:p>
+        </w:tc>
+      </w:tr>
+      <w:tr>
+        <w:trPr>
+          <w:cantSplit/>
+        </w:trPr>
+        <w:tc>
+          <w:tcPr>
+            <w:tcW w:w="560" w:type="dxa"/>
+          </w:tcPr>
+          <w:p>
+            <w:pPr>
+              <w:spacing w:line="276" w:lineRule="auto"/>
+              <w:jc w:val="center"/>
+            </w:pPr>
+            <w:r>
+              <w:rPr>
+                <w:rFonts w:eastAsia="Calibri"/>
+              </w:rPr>
+              <w:t>17</w:t>
             </w:r>
           </w:p>
         </w:tc>

</xml_diff>